<commit_message>
feat: user limiting to 25 agencies and monitoring for admin
</commit_message>
<xml_diff>
--- a/src/assets/templates/Narrative-Report-Template.docx
+++ b/src/assets/templates/Narrative-Report-Template.docx
@@ -3045,186 +3045,6 @@
     </w:p>
     <w:p>
       <w:pPr>
-        <w:spacing w:after="0"/>
-        <w:rPr>
-          <w:rFonts w:ascii="Arial" w:hAnsi="Arial" w:cs="Arial"/>
-          <w:b/>
-          <w:color w:val="C00000"/>
-          <w:sz w:val="28"/>
-          <w:szCs w:val="24"/>
-        </w:rPr>
-      </w:pPr>
-    </w:p>
-    <w:p>
-      <w:pPr>
-        <w:spacing w:after="0"/>
-        <w:rPr>
-          <w:rFonts w:ascii="Arial" w:hAnsi="Arial" w:cs="Arial"/>
-          <w:b/>
-          <w:color w:val="C00000"/>
-          <w:sz w:val="28"/>
-          <w:szCs w:val="24"/>
-        </w:rPr>
-      </w:pPr>
-    </w:p>
-    <w:p>
-      <w:pPr>
-        <w:spacing w:after="0"/>
-        <w:rPr>
-          <w:rFonts w:ascii="Arial" w:hAnsi="Arial" w:cs="Arial"/>
-          <w:b/>
-          <w:color w:val="C00000"/>
-          <w:sz w:val="28"/>
-          <w:szCs w:val="24"/>
-        </w:rPr>
-      </w:pPr>
-    </w:p>
-    <w:p>
-      <w:pPr>
-        <w:spacing w:after="0"/>
-        <w:rPr>
-          <w:rFonts w:ascii="Arial" w:hAnsi="Arial" w:cs="Arial"/>
-          <w:b/>
-          <w:color w:val="C00000"/>
-          <w:sz w:val="28"/>
-          <w:szCs w:val="24"/>
-        </w:rPr>
-      </w:pPr>
-    </w:p>
-    <w:p>
-      <w:pPr>
-        <w:spacing w:after="0"/>
-        <w:rPr>
-          <w:rFonts w:ascii="Arial" w:hAnsi="Arial" w:cs="Arial"/>
-          <w:b/>
-          <w:color w:val="C00000"/>
-          <w:sz w:val="28"/>
-          <w:szCs w:val="24"/>
-        </w:rPr>
-      </w:pPr>
-    </w:p>
-    <w:p>
-      <w:pPr>
-        <w:spacing w:after="0"/>
-        <w:rPr>
-          <w:rFonts w:ascii="Arial" w:hAnsi="Arial" w:cs="Arial"/>
-          <w:b/>
-          <w:color w:val="C00000"/>
-          <w:sz w:val="28"/>
-          <w:szCs w:val="24"/>
-        </w:rPr>
-      </w:pPr>
-    </w:p>
-    <w:p>
-      <w:pPr>
-        <w:spacing w:after="0"/>
-        <w:rPr>
-          <w:rFonts w:ascii="Arial" w:hAnsi="Arial" w:cs="Arial"/>
-          <w:b/>
-          <w:color w:val="C00000"/>
-          <w:sz w:val="28"/>
-          <w:szCs w:val="24"/>
-        </w:rPr>
-      </w:pPr>
-    </w:p>
-    <w:p>
-      <w:pPr>
-        <w:spacing w:after="0"/>
-        <w:rPr>
-          <w:rFonts w:ascii="Arial" w:hAnsi="Arial" w:cs="Arial"/>
-          <w:b/>
-          <w:color w:val="C00000"/>
-          <w:sz w:val="28"/>
-          <w:szCs w:val="24"/>
-        </w:rPr>
-      </w:pPr>
-    </w:p>
-    <w:p>
-      <w:pPr>
-        <w:spacing w:after="0"/>
-        <w:rPr>
-          <w:rFonts w:ascii="Arial" w:hAnsi="Arial" w:cs="Arial"/>
-          <w:b/>
-          <w:color w:val="C00000"/>
-          <w:sz w:val="28"/>
-          <w:szCs w:val="24"/>
-        </w:rPr>
-      </w:pPr>
-    </w:p>
-    <w:p>
-      <w:pPr>
-        <w:spacing w:after="0"/>
-        <w:rPr>
-          <w:rFonts w:ascii="Arial" w:hAnsi="Arial" w:cs="Arial"/>
-          <w:b/>
-          <w:color w:val="C00000"/>
-          <w:sz w:val="28"/>
-          <w:szCs w:val="24"/>
-        </w:rPr>
-      </w:pPr>
-    </w:p>
-    <w:p>
-      <w:pPr>
-        <w:spacing w:after="0"/>
-        <w:rPr>
-          <w:rFonts w:ascii="Arial" w:hAnsi="Arial" w:cs="Arial"/>
-          <w:b/>
-          <w:color w:val="C00000"/>
-          <w:sz w:val="28"/>
-          <w:szCs w:val="24"/>
-        </w:rPr>
-      </w:pPr>
-    </w:p>
-    <w:p>
-      <w:pPr>
-        <w:spacing w:after="0"/>
-        <w:rPr>
-          <w:rFonts w:ascii="Arial" w:hAnsi="Arial" w:cs="Arial"/>
-          <w:b/>
-          <w:color w:val="C00000"/>
-          <w:sz w:val="28"/>
-          <w:szCs w:val="24"/>
-        </w:rPr>
-      </w:pPr>
-    </w:p>
-    <w:p>
-      <w:pPr>
-        <w:spacing w:after="0"/>
-        <w:rPr>
-          <w:rFonts w:ascii="Arial" w:hAnsi="Arial" w:cs="Arial"/>
-          <w:b/>
-          <w:color w:val="C00000"/>
-          <w:sz w:val="28"/>
-          <w:szCs w:val="24"/>
-        </w:rPr>
-      </w:pPr>
-    </w:p>
-    <w:p>
-      <w:pPr>
-        <w:spacing w:after="0"/>
-        <w:rPr>
-          <w:rFonts w:ascii="Arial" w:hAnsi="Arial" w:cs="Arial"/>
-          <w:b/>
-          <w:color w:val="C00000"/>
-          <w:sz w:val="28"/>
-          <w:szCs w:val="24"/>
-        </w:rPr>
-      </w:pPr>
-    </w:p>
-    <w:p>
-      <w:pPr>
-        <w:spacing w:after="0"/>
-        <w:rPr>
-          <w:rFonts w:ascii="Arial" w:hAnsi="Arial" w:cs="Arial"/>
-          <w:b/>
-          <w:color w:val="C00000"/>
-          <w:sz w:val="28"/>
-          <w:szCs w:val="24"/>
-        </w:rPr>
-      </w:pPr>
-    </w:p>
-    <w:p>
-      <w:pPr>
         <w:autoSpaceDE w:val="0"/>
         <w:autoSpaceDN w:val="0"/>
         <w:adjustRightInd w:val="0"/>
@@ -3274,7 +3094,6 @@
           <w:sz w:val="28"/>
           <w:szCs w:val="24"/>
         </w:rPr>
-        <w:lastRenderedPageBreak/>
         <w:t>EXECUTIVE SUMMARY</w:t>
       </w:r>
     </w:p>
@@ -3506,6 +3325,7 @@
           <w:sz w:val="26"/>
           <w:szCs w:val="26"/>
         </w:rPr>
+        <w:lastRenderedPageBreak/>
         <w:t xml:space="preserve">b. What is the Agency’s Priority Agenda and Key Strategies? </w:t>
       </w:r>
     </w:p>
@@ -3529,44 +3349,6 @@
         </w:rPr>
         <w:t xml:space="preserve">c. What are the Strategic Challenges it is encountering?  </w:t>
       </w:r>
-    </w:p>
-    <w:p>
-      <w:pPr>
-        <w:pStyle w:val="BasicParagraph"/>
-        <w:suppressAutoHyphens/>
-        <w:rPr>
-          <w:rFonts w:ascii="Arial" w:hAnsi="Arial" w:cs="Arial"/>
-          <w:bCs/>
-          <w:color w:val="auto"/>
-          <w:sz w:val="26"/>
-          <w:szCs w:val="26"/>
-        </w:rPr>
-      </w:pPr>
-    </w:p>
-    <w:p>
-      <w:pPr>
-        <w:widowControl w:val="0"/>
-        <w:autoSpaceDE w:val="0"/>
-        <w:autoSpaceDN w:val="0"/>
-        <w:adjustRightInd w:val="0"/>
-        <w:spacing w:after="0" w:line="240" w:lineRule="auto"/>
-        <w:jc w:val="both"/>
-        <w:rPr>
-          <w:rFonts w:ascii="Arial" w:hAnsi="Arial" w:cs="Arial"/>
-          <w:sz w:val="26"/>
-          <w:szCs w:val="26"/>
-        </w:rPr>
-      </w:pPr>
-    </w:p>
-    <w:p>
-      <w:pPr>
-        <w:jc w:val="right"/>
-        <w:rPr>
-          <w:rFonts w:ascii="Arial" w:hAnsi="Arial" w:cs="Arial"/>
-          <w:sz w:val="26"/>
-          <w:szCs w:val="26"/>
-        </w:rPr>
-      </w:pPr>
     </w:p>
     <w:p>
       <w:pPr>
@@ -3671,6 +3453,18 @@
         </w:rPr>
       </w:pPr>
     </w:p>
+    <w:p>
+      <w:pPr>
+        <w:pStyle w:val="List"/>
+        <w:jc w:val="both"/>
+        <w:rPr>
+          <w:rFonts w:ascii="Arial" w:hAnsi="Arial" w:cs="Arial"/>
+          <w:color w:val="auto"/>
+          <w:sz w:val="26"/>
+          <w:szCs w:val="26"/>
+        </w:rPr>
+      </w:pPr>
+    </w:p>
     <w:tbl>
       <w:tblPr>
         <w:tblStyle w:val="TableGrid"/>
@@ -4174,6 +3968,183 @@
         </w:rPr>
         <w:t xml:space="preserve">This section will provide the detailed quantitative assessment results. </w:t>
       </w:r>
+    </w:p>
+    <w:p>
+      <w:pPr>
+        <w:autoSpaceDE w:val="0"/>
+        <w:autoSpaceDN w:val="0"/>
+        <w:adjustRightInd w:val="0"/>
+        <w:spacing w:after="0"/>
+        <w:rPr>
+          <w:rFonts w:ascii="Arial" w:hAnsi="Arial" w:cs="Arial"/>
+          <w:szCs w:val="24"/>
+        </w:rPr>
+      </w:pPr>
+      <w:r>
+        <w:rPr>
+          <w:rFonts w:ascii="Times New Roman" w:hAnsi="Times New Roman"/>
+          <w:noProof/>
+          <w:sz w:val="24"/>
+          <w:szCs w:val="24"/>
+        </w:rPr>
+        <w:lastRenderedPageBreak/>
+        <w:drawing>
+          <wp:anchor distT="0" distB="0" distL="114300" distR="114300" simplePos="0" relativeHeight="251659264" behindDoc="1" locked="0" layoutInCell="1" allowOverlap="1" wp14:anchorId="3BBF9EBA" wp14:editId="7E45AC65">
+            <wp:simplePos x="0" y="0"/>
+            <wp:positionH relativeFrom="column">
+              <wp:posOffset>0</wp:posOffset>
+            </wp:positionH>
+            <wp:positionV relativeFrom="paragraph">
+              <wp:posOffset>170815</wp:posOffset>
+            </wp:positionV>
+            <wp:extent cx="5732145" cy="7087870"/>
+            <wp:effectExtent l="0" t="0" r="1905" b="0"/>
+            <wp:wrapTight wrapText="bothSides">
+              <wp:wrapPolygon edited="0">
+                <wp:start x="0" y="0"/>
+                <wp:lineTo x="0" y="21538"/>
+                <wp:lineTo x="21535" y="21538"/>
+                <wp:lineTo x="21535" y="0"/>
+                <wp:lineTo x="0" y="0"/>
+              </wp:wrapPolygon>
+            </wp:wrapTight>
+            <wp:docPr id="1871522663" name="Picture 2"/>
+            <wp:cNvGraphicFramePr>
+              <a:graphicFrameLocks xmlns:a="http://schemas.openxmlformats.org/drawingml/2006/main" noChangeAspect="1"/>
+            </wp:cNvGraphicFramePr>
+            <a:graphic xmlns:a="http://schemas.openxmlformats.org/drawingml/2006/main">
+              <a:graphicData uri="http://schemas.openxmlformats.org/drawingml/2006/picture">
+                <pic:pic xmlns:pic="http://schemas.openxmlformats.org/drawingml/2006/picture">
+                  <pic:nvPicPr>
+                    <pic:cNvPr id="0" name="Picture 3"/>
+                    <pic:cNvPicPr>
+                      <a:picLocks noChangeAspect="1" noChangeArrowheads="1"/>
+                    </pic:cNvPicPr>
+                  </pic:nvPicPr>
+                  <pic:blipFill>
+                    <a:blip r:embed="rId14">
+                      <a:extLst>
+                        <a:ext uri="{28A0092B-C50C-407E-A947-70E740481C1C}">
+                          <a14:useLocalDpi xmlns:a14="http://schemas.microsoft.com/office/drawing/2010/main" val="0"/>
+                        </a:ext>
+                      </a:extLst>
+                    </a:blip>
+                    <a:srcRect/>
+                    <a:stretch>
+                      <a:fillRect/>
+                    </a:stretch>
+                  </pic:blipFill>
+                  <pic:spPr bwMode="auto">
+                    <a:xfrm>
+                      <a:off x="0" y="0"/>
+                      <a:ext cx="5732145" cy="7087870"/>
+                    </a:xfrm>
+                    <a:prstGeom prst="rect">
+                      <a:avLst/>
+                    </a:prstGeom>
+                    <a:noFill/>
+                  </pic:spPr>
+                </pic:pic>
+              </a:graphicData>
+            </a:graphic>
+            <wp14:sizeRelH relativeFrom="page">
+              <wp14:pctWidth>0</wp14:pctWidth>
+            </wp14:sizeRelH>
+            <wp14:sizeRelV relativeFrom="page">
+              <wp14:pctHeight>0</wp14:pctHeight>
+            </wp14:sizeRelV>
+          </wp:anchor>
+        </w:drawing>
+      </w:r>
+    </w:p>
+    <w:p>
+      <w:pPr>
+        <w:spacing w:after="0"/>
+        <w:jc w:val="both"/>
+        <w:rPr>
+          <w:rFonts w:ascii="Arial" w:hAnsi="Arial" w:cs="Arial"/>
+          <w:b/>
+          <w:lang w:eastAsia="en-PH"/>
+        </w:rPr>
+      </w:pPr>
+    </w:p>
+    <w:p>
+      <w:pPr>
+        <w:spacing w:after="0"/>
+        <w:jc w:val="both"/>
+        <w:rPr>
+          <w:rFonts w:ascii="Arial" w:hAnsi="Arial" w:cs="Arial"/>
+          <w:b/>
+          <w:lang w:eastAsia="en-PH"/>
+        </w:rPr>
+      </w:pPr>
+      <w:r>
+        <w:rPr>
+          <w:rFonts w:ascii="Times New Roman" w:hAnsi="Times New Roman"/>
+          <w:noProof/>
+          <w:sz w:val="24"/>
+          <w:szCs w:val="24"/>
+        </w:rPr>
+        <w:lastRenderedPageBreak/>
+        <w:drawing>
+          <wp:inline distT="0" distB="0" distL="0" distR="0" wp14:anchorId="7F1E5521" wp14:editId="7CCE114A">
+            <wp:extent cx="5732145" cy="5212080"/>
+            <wp:effectExtent l="0" t="0" r="1905" b="7620"/>
+            <wp:docPr id="317245758" name="Picture 4"/>
+            <wp:cNvGraphicFramePr>
+              <a:graphicFrameLocks xmlns:a="http://schemas.openxmlformats.org/drawingml/2006/main" noChangeAspect="1"/>
+            </wp:cNvGraphicFramePr>
+            <a:graphic xmlns:a="http://schemas.openxmlformats.org/drawingml/2006/main">
+              <a:graphicData uri="http://schemas.openxmlformats.org/drawingml/2006/picture">
+                <pic:pic xmlns:pic="http://schemas.openxmlformats.org/drawingml/2006/picture">
+                  <pic:nvPicPr>
+                    <pic:cNvPr id="0" name="Picture 5"/>
+                    <pic:cNvPicPr>
+                      <a:picLocks noChangeAspect="1" noChangeArrowheads="1"/>
+                    </pic:cNvPicPr>
+                  </pic:nvPicPr>
+                  <pic:blipFill>
+                    <a:blip r:embed="rId15">
+                      <a:extLst>
+                        <a:ext uri="{28A0092B-C50C-407E-A947-70E740481C1C}">
+                          <a14:useLocalDpi xmlns:a14="http://schemas.microsoft.com/office/drawing/2010/main" val="0"/>
+                        </a:ext>
+                      </a:extLst>
+                    </a:blip>
+                    <a:srcRect/>
+                    <a:stretch>
+                      <a:fillRect/>
+                    </a:stretch>
+                  </pic:blipFill>
+                  <pic:spPr bwMode="auto">
+                    <a:xfrm>
+                      <a:off x="0" y="0"/>
+                      <a:ext cx="5732145" cy="5212080"/>
+                    </a:xfrm>
+                    <a:prstGeom prst="rect">
+                      <a:avLst/>
+                    </a:prstGeom>
+                    <a:noFill/>
+                  </pic:spPr>
+                </pic:pic>
+              </a:graphicData>
+            </a:graphic>
+          </wp:inline>
+        </w:drawing>
+      </w:r>
+    </w:p>
+    <w:p>
+      <w:pPr>
+        <w:spacing w:after="0"/>
+        <w:jc w:val="both"/>
+        <w:rPr>
+          <w:rFonts w:ascii="Arial" w:hAnsi="Arial" w:cs="Arial"/>
+          <w:b/>
+          <w:sz w:val="28"/>
+          <w:szCs w:val="24"/>
+          <w:lang w:eastAsia="en-PH"/>
+        </w:rPr>
+      </w:pPr>
     </w:p>
     <w:p>
       <w:pPr>
@@ -4881,6 +4852,7 @@
           <w:szCs w:val="26"/>
           <w:lang w:eastAsia="en-PH"/>
         </w:rPr>
+        <w:lastRenderedPageBreak/>
         <w:t xml:space="preserve">Identify where the agency scored less than 100% in for each of the 4 core HRM system. </w:t>
       </w:r>
       <w:r>
@@ -6271,6 +6243,7 @@
                 <w:szCs w:val="24"/>
                 <w:lang w:eastAsia="en-PH"/>
               </w:rPr>
+              <w:lastRenderedPageBreak/>
               <w:t>Learning &amp; Development</w:t>
             </w:r>
             <w:r>
@@ -6358,8 +6331,8 @@
       </w:pPr>
     </w:p>
     <w:sectPr>
-      <w:headerReference w:type="default" r:id="rId14"/>
-      <w:footerReference w:type="default" r:id="rId15"/>
+      <w:headerReference w:type="default" r:id="rId16"/>
+      <w:footerReference w:type="default" r:id="rId17"/>
       <w:pgSz w:w="11907" w:h="16839" w:code="9"/>
       <w:pgMar w:top="1440" w:right="1440" w:bottom="1440" w:left="1440" w:header="720" w:footer="720" w:gutter="0"/>
       <w:cols w:space="720"/>

</xml_diff>